<commit_message>
Recruiter: trasferimento Milano/Torino, data di nascita, esperienza
</commit_message>
<xml_diff>
--- a/core/static/core/cv/Stella_Marucelli_CV.docx
+++ b/core/static/core/cv/Stella_Marucelli_CV.docx
@@ -84,7 +84,7 @@
           <w:sz w:val="19"/>
           <w:szCs w:val="19"/>
         </w:rPr>
-        <w:t xml:space="preserve">stella.marucelli@gmail.com  ·  +39 378 066 2596  ·  Reggello (FI), Italia</w:t>
+        <w:t xml:space="preserve">stella.marucelli@gmail.com  ·  +39 378 066 2596  ·  Reggello (FI), Italia  ·  Nata il 02/11/1992</w:t>
       </w:r>
     </w:p>
     <w:p>
@@ -384,6 +384,29 @@
       <w:r>
         <w:rPr>
           <w:rFonts w:ascii="Calibri" w:cs="Calibri" w:eastAsia="Calibri" w:hAnsi="Calibri"/>
+          <w:b/>
+          <w:bCs/>
+          <w:sz w:val="19"/>
+          <w:szCs w:val="19"/>
+        </w:rPr>
+        <w:t xml:space="preserve">Esperienza nel settore IT: circa 2 anni</w:t>
+      </w:r>
+      <w:r>
+        <w:rPr>
+          <w:rFonts w:ascii="Calibri" w:cs="Calibri" w:eastAsia="Calibri" w:hAnsi="Calibri"/>
+          <w:sz w:val="19"/>
+          <w:szCs w:val="19"/>
+        </w:rPr>
+        <w:t xml:space="preserve"> tra formazione intensiva (Master Full Stack Developer Epicode, JEE Academy) e 1 anno di lavoro in azienda (Sellogic).</w:t>
+      </w:r>
+    </w:p>
+    <w:p>
+      <w:pPr>
+        <w:spacing w:after="80" w:before="0"/>
+      </w:pPr>
+      <w:r>
+        <w:rPr>
+          <w:rFonts w:ascii="Calibri" w:cs="Calibri" w:eastAsia="Calibri" w:hAnsi="Calibri"/>
           <w:sz w:val="19"/>
           <w:szCs w:val="19"/>
         </w:rPr>
@@ -423,7 +446,25 @@
           <w:sz w:val="19"/>
           <w:szCs w:val="19"/>
         </w:rPr>
-        <w:t xml:space="preserve"> o ibridi. Disponibile da subito, come </w:t>
+        <w:t xml:space="preserve"> o ibridi. Disponibile da subito, cerco un’opportunità che mi permetta di </w:t>
+      </w:r>
+      <w:r>
+        <w:rPr>
+          <w:rFonts w:ascii="Calibri" w:cs="Calibri" w:eastAsia="Calibri" w:hAnsi="Calibri"/>
+          <w:b/>
+          <w:bCs/>
+          <w:sz w:val="19"/>
+          <w:szCs w:val="19"/>
+        </w:rPr>
+        <w:t xml:space="preserve">trasferirmi a Milano o Torino</w:t>
+      </w:r>
+      <w:r>
+        <w:rPr>
+          <w:rFonts w:ascii="Calibri" w:cs="Calibri" w:eastAsia="Calibri" w:hAnsi="Calibri"/>
+          <w:sz w:val="19"/>
+          <w:szCs w:val="19"/>
+        </w:rPr>
+        <w:t xml:space="preserve">: lavoro in sede o ibrido, con contratto da </w:t>
       </w:r>
       <w:r>
         <w:rPr>
@@ -441,61 +482,25 @@
           <w:sz w:val="19"/>
           <w:szCs w:val="19"/>
         </w:rPr>
-        <w:t xml:space="preserve"> o in </w:t>
-      </w:r>
-      <w:r>
-        <w:rPr>
-          <w:rFonts w:ascii="Calibri" w:cs="Calibri" w:eastAsia="Calibri" w:hAnsi="Calibri"/>
-          <w:b/>
-          <w:bCs/>
-          <w:sz w:val="19"/>
-          <w:szCs w:val="19"/>
-        </w:rPr>
-        <w:t xml:space="preserve">Partita IVA</w:t>
-      </w:r>
-      <w:r>
-        <w:rPr>
-          <w:rFonts w:ascii="Calibri" w:cs="Calibri" w:eastAsia="Calibri" w:hAnsi="Calibri"/>
-          <w:sz w:val="19"/>
-          <w:szCs w:val="19"/>
-        </w:rPr>
-        <w:t xml:space="preserve">: </w:t>
-      </w:r>
-      <w:r>
-        <w:rPr>
-          <w:rFonts w:ascii="Calibri" w:cs="Calibri" w:eastAsia="Calibri" w:hAnsi="Calibri"/>
-          <w:b/>
-          <w:bCs/>
-          <w:sz w:val="19"/>
-          <w:szCs w:val="19"/>
-        </w:rPr>
-        <w:t xml:space="preserve">full remote</w:t>
-      </w:r>
-      <w:r>
-        <w:rPr>
-          <w:rFonts w:ascii="Calibri" w:cs="Calibri" w:eastAsia="Calibri" w:hAnsi="Calibri"/>
-          <w:sz w:val="19"/>
-          <w:szCs w:val="19"/>
-        </w:rPr>
-        <w:t xml:space="preserve"> oppure </w:t>
-      </w:r>
-      <w:r>
-        <w:rPr>
-          <w:rFonts w:ascii="Calibri" w:cs="Calibri" w:eastAsia="Calibri" w:hAnsi="Calibri"/>
-          <w:b/>
-          <w:bCs/>
-          <w:sz w:val="19"/>
-          <w:szCs w:val="19"/>
-        </w:rPr>
-        <w:t xml:space="preserve">ibrido</w:t>
-      </w:r>
-      <w:r>
-        <w:rPr>
-          <w:rFonts w:ascii="Calibri" w:cs="Calibri" w:eastAsia="Calibri" w:hAnsi="Calibri"/>
-          <w:sz w:val="19"/>
-          <w:szCs w:val="19"/>
-        </w:rPr>
-        <w:t xml:space="preserve"> (in sede regolarmente se vicina, poche volte al mese se distante); valuto anche il trasferimento.</w:t>
+        <w:t xml:space="preserve"> anche </w:t>
+      </w:r>
+      <w:r>
+        <w:rPr>
+          <w:rFonts w:ascii="Calibri" w:cs="Calibri" w:eastAsia="Calibri" w:hAnsi="Calibri"/>
+          <w:b/>
+          <w:bCs/>
+          <w:sz w:val="19"/>
+          <w:szCs w:val="19"/>
+        </w:rPr>
+        <w:t xml:space="preserve">a tempo determinato</w:t>
+      </w:r>
+      <w:r>
+        <w:rPr>
+          <w:rFonts w:ascii="Calibri" w:cs="Calibri" w:eastAsia="Calibri" w:hAnsi="Calibri"/>
+          <w:sz w:val="19"/>
+          <w:szCs w:val="19"/>
+        </w:rPr>
+        <w:t xml:space="preserve">. Valuto anche full remote e Partita IVA.</w:t>
       </w:r>
     </w:p>
     <w:p>

</xml_diff>

<commit_message>
CV: Selenium tra le competenze di Test Automation
</commit_message>
<xml_diff>
--- a/core/static/core/cv/Stella_Marucelli_CV.docx
+++ b/core/static/core/cv/Stella_Marucelli_CV.docx
@@ -544,7 +544,7 @@
           <w:sz w:val="19"/>
           <w:szCs w:val="19"/>
         </w:rPr>
-        <w:t xml:space="preserve">Playwright (Python · .NET), Cypress, Robot Framework, Appium, Cucumber (BDD · Gherkin), Pytest, xUnit, TestNG, Page Object Model, Faker / Datafaker</w:t>
+        <w:t xml:space="preserve">Playwright (Python · .NET), Selenium, Cypress, Robot Framework, Appium, Cucumber (BDD · Gherkin), Pytest, xUnit, TestNG, Page Object Model, Faker / Datafaker</w:t>
       </w:r>
     </w:p>
     <w:p>
@@ -664,7 +664,7 @@
           <w:sz w:val="19"/>
           <w:szCs w:val="19"/>
         </w:rPr>
-        <w:t xml:space="preserve">Jira, Appium Inspector, Flutter DevTools, Claude Code, Cursor, GitHub Copilot, Selenium, Xray / TestRail, Jenkins</w:t>
+        <w:t xml:space="preserve">Jira, Appium Inspector, Flutter DevTools, Claude Code, Cursor, GitHub Copilot, Xray / TestRail, Jenkins</w:t>
       </w:r>
     </w:p>
     <w:p>

</xml_diff>

<commit_message>
Trasferimento: Nord Italia con avvio da remoto
</commit_message>
<xml_diff>
--- a/core/static/core/cv/Stella_Marucelli_CV.docx
+++ b/core/static/core/cv/Stella_Marucelli_CV.docx
@@ -456,15 +456,15 @@
           <w:sz w:val="19"/>
           <w:szCs w:val="19"/>
         </w:rPr>
-        <w:t xml:space="preserve">trasferirmi a Milano o Torino</w:t>
-      </w:r>
-      <w:r>
-        <w:rPr>
-          <w:rFonts w:ascii="Calibri" w:cs="Calibri" w:eastAsia="Calibri" w:hAnsi="Calibri"/>
-          <w:sz w:val="19"/>
-          <w:szCs w:val="19"/>
-        </w:rPr>
-        <w:t xml:space="preserve">: lavoro in sede o ibrido, con contratto da </w:t>
+        <w:t xml:space="preserve">trasferirmi nel Nord Italia</w:t>
+      </w:r>
+      <w:r>
+        <w:rPr>
+          <w:rFonts w:ascii="Calibri" w:cs="Calibri" w:eastAsia="Calibri" w:hAnsi="Calibri"/>
+          <w:sz w:val="19"/>
+          <w:szCs w:val="19"/>
+        </w:rPr>
+        <w:t xml:space="preserve"> (dall’Emilia-Romagna in su): lavoro in sede o ibrido, con contratto da </w:t>
       </w:r>
       <w:r>
         <w:rPr>
@@ -500,7 +500,7 @@
           <w:sz w:val="19"/>
           <w:szCs w:val="19"/>
         </w:rPr>
-        <w:t xml:space="preserve">. Valuto anche full remote e Partita IVA.</w:t>
+        <w:t xml:space="preserve">. Per poter affittare casa mi serve un contratto attivo: dopo la firma chiedo di iniziare da remoto per il tempo necessario a trovare un alloggio, poi mi trasferisco. Valuto anche full remote e Partita IVA.</w:t>
       </w:r>
     </w:p>
     <w:p>

</xml_diff>

<commit_message>
Esperienza progetti personali 2024 e documenti aggiornati
</commit_message>
<xml_diff>
--- a/core/static/core/cv/Stella_Marucelli_CV.docx
+++ b/core/static/core/cv/Stella_Marucelli_CV.docx
@@ -1845,6 +1845,143 @@
           <w:szCs w:val="19"/>
         </w:rPr>
         <w:t xml:space="preserve">Bug fixing critico: crash da cast non sicuri sulla configurazione globale e loop infiniti di navigazione dovuti ai flag di configurazione.</w:t>
+      </w:r>
+    </w:p>
+    <w:p>
+      <w:pPr>
+        <w:keepNext/>
+        <w:tabs>
+          <w:tab w:val="right" w:pos="9638"/>
+        </w:tabs>
+        <w:spacing w:after="30" w:before="80"/>
+      </w:pPr>
+      <w:r>
+        <w:rPr>
+          <w:rFonts w:ascii="Calibri" w:cs="Calibri" w:eastAsia="Calibri" w:hAnsi="Calibri"/>
+          <w:b/>
+          <w:bCs/>
+          <w:sz w:val="21"/>
+          <w:szCs w:val="21"/>
+        </w:rPr>
+        <w:t xml:space="preserve">Full Stack Developer &amp; Test Automation</w:t>
+      </w:r>
+      <w:r>
+        <w:rPr>
+          <w:rFonts w:ascii="Calibri" w:cs="Calibri" w:eastAsia="Calibri" w:hAnsi="Calibri"/>
+          <w:color w:val="6D28D9"/>
+          <w:sz w:val="21"/>
+          <w:szCs w:val="21"/>
+        </w:rPr>
+        <w:t xml:space="preserve"> — Progetti personali</w:t>
+      </w:r>
+      <w:r>
+        <w:rPr>
+          <w:rFonts w:ascii="Calibri" w:cs="Calibri" w:eastAsia="Calibri" w:hAnsi="Calibri"/>
+          <w:color w:val="475569"/>
+          <w:sz w:val="18"/>
+          <w:szCs w:val="18"/>
+        </w:rPr>
+        <w:t xml:space="preserve">	2024 — oggi</w:t>
+      </w:r>
+    </w:p>
+    <w:p>
+      <w:pPr>
+        <w:spacing w:after="50" w:before="0"/>
+      </w:pPr>
+      <w:r>
+        <w:rPr>
+          <w:rFonts w:ascii="Calibri" w:cs="Calibri" w:eastAsia="Calibri" w:hAnsi="Calibri"/>
+          <w:i/>
+          <w:iCs/>
+          <w:color w:val="475569"/>
+          <w:sz w:val="19"/>
+          <w:szCs w:val="19"/>
+        </w:rPr>
+        <w:t xml:space="preserve">Applicazioni complete su repository GitHub pubblici, con codice, test automatici e pipeline CI (dettagli in "Progetto principale" e "Altri progetti").</w:t>
+      </w:r>
+    </w:p>
+    <w:p>
+      <w:pPr>
+        <w:pStyle w:val="ListParagraph"/>
+        <w:numPr>
+          <w:ilvl w:val="0"/>
+          <w:numId w:val="2"/>
+        </w:numPr>
+        <w:spacing w:after="30"/>
+      </w:pPr>
+      <w:r>
+        <w:rPr>
+          <w:rFonts w:ascii="Calibri" w:cs="Calibri" w:eastAsia="Calibri" w:hAnsi="Calibri"/>
+          <w:b/>
+          <w:bCs/>
+          <w:sz w:val="19"/>
+          <w:szCs w:val="19"/>
+        </w:rPr>
+        <w:t xml:space="preserve">Restaurant Management System</w:t>
+      </w:r>
+      <w:r>
+        <w:rPr>
+          <w:rFonts w:ascii="Calibri" w:cs="Calibri" w:eastAsia="Calibri" w:hAnsi="Calibri"/>
+          <w:sz w:val="19"/>
+          <w:szCs w:val="19"/>
+        </w:rPr>
+        <w:t xml:space="preserve"> — backend ASP.NET Core + PostgreSQL, gestionale Angular e kiosk Flutter; 49 test API, 94 test E2E in Robot Framework e 26 scenari BDD mobile in GitLab CI con Docker; 15 bug reali trovati e corretti.</w:t>
+      </w:r>
+    </w:p>
+    <w:p>
+      <w:pPr>
+        <w:pStyle w:val="ListParagraph"/>
+        <w:numPr>
+          <w:ilvl w:val="0"/>
+          <w:numId w:val="2"/>
+        </w:numPr>
+        <w:spacing w:after="30"/>
+      </w:pPr>
+      <w:r>
+        <w:rPr>
+          <w:rFonts w:ascii="Calibri" w:cs="Calibri" w:eastAsia="Calibri" w:hAnsi="Calibri"/>
+          <w:b/>
+          <w:bCs/>
+          <w:sz w:val="19"/>
+          <w:szCs w:val="19"/>
+        </w:rPr>
+        <w:t xml:space="preserve">Portfolio QA in Django</w:t>
+      </w:r>
+      <w:r>
+        <w:rPr>
+          <w:rFonts w:ascii="Calibri" w:cs="Calibri" w:eastAsia="Calibri" w:hAnsi="Calibri"/>
+          <w:sz w:val="19"/>
+          <w:szCs w:val="19"/>
+        </w:rPr>
+        <w:t xml:space="preserve"> — deploy su Render con Postgres su Neon, testato con pytest-django e Playwright in GitHub Actions.</w:t>
+      </w:r>
+    </w:p>
+    <w:p>
+      <w:pPr>
+        <w:pStyle w:val="ListParagraph"/>
+        <w:numPr>
+          <w:ilvl w:val="0"/>
+          <w:numId w:val="2"/>
+        </w:numPr>
+        <w:spacing w:after="30"/>
+      </w:pPr>
+      <w:r>
+        <w:rPr>
+          <w:rFonts w:ascii="Calibri" w:cs="Calibri" w:eastAsia="Calibri" w:hAnsi="Calibri"/>
+          <w:b/>
+          <w:bCs/>
+          <w:sz w:val="19"/>
+          <w:szCs w:val="19"/>
+        </w:rPr>
+        <w:t xml:space="preserve">Automazione in Python</w:t>
+      </w:r>
+      <w:r>
+        <w:rPr>
+          <w:rFonts w:ascii="Calibri" w:cs="Calibri" w:eastAsia="Calibri" w:hAnsi="Calibri"/>
+          <w:sz w:val="19"/>
+          <w:szCs w:val="19"/>
+        </w:rPr>
+        <w:t xml:space="preserve"> — Job Aggregator e Housing Aggregator: REST API, Gmail API (OAuth2), parsing HTML, deduplicazione e dashboard su PostgreSQL.</w:t>
       </w:r>
     </w:p>
     <w:p>

</xml_diff>

<commit_message>
CV v6: QA Scenari AI come progetto principale, Restaurant Management System più sintetico; scheda candidato e Word aggiornati
Co-Authored-By: Claude Opus 5.5 <noreply@anthropic.com>
Claude-Session: https://claude.ai/code/session_01Lw52jSLqbzCjKwSjaakRmr
</commit_message>
<xml_diff>
--- a/core/static/core/cv/Stella_Marucelli_CV.docx
+++ b/core/static/core/cv/Stella_Marucelli_CV.docx
@@ -374,7 +374,7 @@
           <w:sz w:val="19"/>
           <w:szCs w:val="19"/>
         </w:rPr>
-        <w:t xml:space="preserve"> sull'app mobile (Appium + REST Assured), che hanno trovato bug reali.</w:t>
+        <w:t xml:space="preserve"> sull'app mobile (Appium + REST Assured), che hanno trovato bug reali. Il progetto più recente è QA Scenari AI: dal requisito, con un modello AI locale, genera scenari Gherkin, domande aperte e scheletri di test, con prompt misurati su un riferimento scritto a mano.</w:t>
       </w:r>
     </w:p>
     <w:p>
@@ -664,7 +664,7 @@
           <w:sz w:val="19"/>
           <w:szCs w:val="19"/>
         </w:rPr>
-        <w:t xml:space="preserve">Jira, Appium Inspector, Flutter DevTools, Claude Code, Cursor, GitHub Copilot, Xray / TestRail, Jenkins</w:t>
+        <w:t>Jira, Appium Inspector, Flutter DevTools, Claude Code, Ollama (LLM locale), Cursor, GitHub Copilot, Xray / TestRail, Jenkins</w:t>
       </w:r>
     </w:p>
     <w:p>
@@ -684,7 +684,7 @@
           <w:sz w:val="21"/>
           <w:szCs w:val="21"/>
         </w:rPr>
-        <w:t xml:space="preserve">PROGETTO PRINCIPALE</w:t>
+        <w:t>PROGETTI PRINCIPALI</w:t>
       </w:r>
     </w:p>
     <w:p>
@@ -703,6 +703,295 @@
           <w:sz w:val="22"/>
           <w:szCs w:val="22"/>
         </w:rPr>
+        <w:t>QA Scenari AI — dal requisito agli scenari di test, con un modello AI locale</w:t>
+      </w:r>
+      <w:r>
+        <w:rPr>
+          <w:rFonts w:ascii="Calibri" w:cs="Calibri" w:eastAsia="Calibri" w:hAnsi="Calibri"/>
+          <w:bCs/>
+          <w:sz w:val="22"/>
+          <w:szCs w:val="22"/>
+        </w:rPr>
+        <w:tab/>
+        <w:t>progetto personale · 2026</w:t>
+      </w:r>
+    </w:p>
+    <w:p>
+      <w:pPr>
+        <w:spacing w:after="50" w:before="0"/>
+      </w:pPr>
+      <w:r>
+        <w:rPr>
+          <w:rFonts w:ascii="Calibri" w:cs="Calibri" w:eastAsia="Calibri" w:hAnsi="Calibri"/>
+          <w:color w:val="475569"/>
+          <w:sz w:val="19"/>
+          <w:szCs w:val="19"/>
+        </w:rPr>
+        <w:t>Strumento personale che uso come base per testare i progetti: scrivo il requisito, una regola per riga, scelgo le checklist dell'area e un modello AI che gira sul mio computer (Ollama, qwen2.5:3b, gratis e senza API key) restituisce scenari Gherkin, domande aperte per il product owner e scheletri di codice in Playwright, Robot Framework e Appium. Nato riusando lo scheletro di un agente AI per le candidature che avevo fermato per i troppi limiti.</w:t>
+      </w:r>
+    </w:p>
+    <w:p>
+      <w:pPr>
+        <w:spacing w:after="60" w:before="0"/>
+      </w:pPr>
+      <w:r>
+        <w:rPr>
+          <w:rFonts w:ascii="Calibri" w:cs="Calibri" w:eastAsia="Calibri" w:hAnsi="Calibri"/>
+          <w:b/>
+          <w:bCs/>
+          <w:color w:val="047857"/>
+          <w:sz w:val="19"/>
+          <w:szCs w:val="19"/>
+        </w:rPr>
+        <w:t>24 checklist QA   ·   431 punti da verificare   ·   13 controlli automatici   ·   4 → 21 scenari (requisito vago / chiaro)</w:t>
+      </w:r>
+    </w:p>
+    <w:p>
+      <w:pPr>
+        <w:keepNext/>
+        <w:spacing w:after="30" w:before="40"/>
+      </w:pPr>
+      <w:r>
+        <w:rPr>
+          <w:rFonts w:ascii="Calibri" w:cs="Calibri" w:eastAsia="Calibri" w:hAnsi="Calibri"/>
+          <w:b/>
+          <w:bCs/>
+          <w:color w:val="6D28D9"/>
+          <w:sz w:val="19"/>
+          <w:szCs w:val="19"/>
+        </w:rPr>
+        <w:t>Come funziona — prompt chaining</w:t>
+      </w:r>
+    </w:p>
+    <w:p>
+      <w:pPr>
+        <w:pStyle w:val="ListParagraph"/>
+        <w:numPr>
+          <w:ilvl w:val="0"/>
+          <w:numId w:val="2"/>
+        </w:numPr>
+        <w:spacing w:after="30"/>
+      </w:pPr>
+      <w:r>
+        <w:rPr>
+          <w:rFonts w:ascii="Calibri" w:cs="Calibri" w:eastAsia="Calibri" w:hAnsi="Calibri"/>
+          <w:sz w:val="19"/>
+          <w:szCs w:val="19"/>
+        </w:rPr>
+        <w:t>Un punto della checklist alla volta. Passo A: quale riga del requisito ne parla? (0 = nessuna → domanda aperta, non comportamento inventato).</w:t>
+      </w:r>
+    </w:p>
+    <w:p>
+      <w:pPr>
+        <w:pStyle w:val="ListParagraph"/>
+        <w:numPr>
+          <w:ilvl w:val="0"/>
+          <w:numId w:val="2"/>
+        </w:numPr>
+        <w:spacing w:after="30"/>
+      </w:pPr>
+      <w:r>
+        <w:rPr>
+          <w:rFonts w:ascii="Calibri" w:cs="Calibri" w:eastAsia="Calibri" w:hAnsi="Calibri"/>
+          <w:sz w:val="19"/>
+          <w:szCs w:val="19"/>
+        </w:rPr>
+        <w:t>Passo B: lo scenario, con un esempio per area e per livello (unit / api / e2e).</w:t>
+      </w:r>
+    </w:p>
+    <w:p>
+      <w:pPr>
+        <w:pStyle w:val="ListParagraph"/>
+        <w:numPr>
+          <w:ilvl w:val="0"/>
+          <w:numId w:val="2"/>
+        </w:numPr>
+        <w:spacing w:after="30"/>
+      </w:pPr>
+      <w:r>
+        <w:rPr>
+          <w:rFonts w:ascii="Calibri" w:cs="Calibri" w:eastAsia="Calibri" w:hAnsi="Calibri"/>
+          <w:sz w:val="19"/>
+          <w:szCs w:val="19"/>
+        </w:rPr>
+        <w:t>Gherkin e scheletri li scrive Python, non l'AI: sintassi sempre corretta, metodi TODO che falliscono apposta.</w:t>
+      </w:r>
+    </w:p>
+    <w:p>
+      <w:pPr>
+        <w:keepNext/>
+        <w:spacing w:after="30" w:before="40"/>
+      </w:pPr>
+      <w:r>
+        <w:rPr>
+          <w:rFonts w:ascii="Calibri" w:cs="Calibri" w:eastAsia="Calibri" w:hAnsi="Calibri"/>
+          <w:b/>
+          <w:bCs/>
+          <w:color w:val="6D28D9"/>
+          <w:sz w:val="19"/>
+          <w:szCs w:val="19"/>
+        </w:rPr>
+        <w:t>AI sotto controllo — JSON con schema</w:t>
+      </w:r>
+    </w:p>
+    <w:p>
+      <w:pPr>
+        <w:pStyle w:val="ListParagraph"/>
+        <w:numPr>
+          <w:ilvl w:val="0"/>
+          <w:numId w:val="2"/>
+        </w:numPr>
+        <w:spacing w:after="30"/>
+      </w:pPr>
+      <w:r>
+        <w:rPr>
+          <w:rFonts w:ascii="Calibri" w:cs="Calibri" w:eastAsia="Calibri" w:hAnsi="Calibri"/>
+          <w:sz w:val="19"/>
+          <w:szCs w:val="19"/>
+        </w:rPr>
+        <w:t>Risposte in JSON con schema Pydantic e liste chiuse (Literal) per riga e livello.</w:t>
+      </w:r>
+    </w:p>
+    <w:p>
+      <w:pPr>
+        <w:pStyle w:val="ListParagraph"/>
+        <w:numPr>
+          <w:ilvl w:val="0"/>
+          <w:numId w:val="2"/>
+        </w:numPr>
+        <w:spacing w:after="30"/>
+      </w:pPr>
+      <w:r>
+        <w:rPr>
+          <w:rFonts w:ascii="Calibri" w:cs="Calibri" w:eastAsia="Calibri" w:hAnsi="Calibri"/>
+          <w:sz w:val="19"/>
+          <w:szCs w:val="19"/>
+        </w:rPr>
+        <w:t>13 controlli di forma: codice nel Gherkin, testi inventati, @api scritto come interfaccia, "allora" che si contraddice, doppioni.</w:t>
+      </w:r>
+    </w:p>
+    <w:p>
+      <w:pPr>
+        <w:pStyle w:val="ListParagraph"/>
+        <w:numPr>
+          <w:ilvl w:val="0"/>
+          <w:numId w:val="2"/>
+        </w:numPr>
+        <w:spacing w:after="30"/>
+      </w:pPr>
+      <w:r>
+        <w:rPr>
+          <w:rFonts w:ascii="Calibri" w:cs="Calibri" w:eastAsia="Calibri" w:hAnsi="Calibri"/>
+          <w:sz w:val="19"/>
+          <w:szCs w:val="19"/>
+        </w:rPr>
+        <w:t>Ciclo di correzione: l'errore torna all'AI (max 3 tentativi); se resta, lo scenario è segnato "da controllare a mano".</w:t>
+      </w:r>
+    </w:p>
+    <w:p>
+      <w:pPr>
+        <w:keepNext/>
+        <w:spacing w:after="30" w:before="40"/>
+      </w:pPr>
+      <w:r>
+        <w:rPr>
+          <w:rFonts w:ascii="Calibri" w:cs="Calibri" w:eastAsia="Calibri" w:hAnsi="Calibri"/>
+          <w:b/>
+          <w:bCs/>
+          <w:color w:val="6D28D9"/>
+          <w:sz w:val="19"/>
+          <w:szCs w:val="19"/>
+        </w:rPr>
+        <w:t>Misure — come per i test flaky</w:t>
+      </w:r>
+    </w:p>
+    <w:p>
+      <w:pPr>
+        <w:pStyle w:val="ListParagraph"/>
+        <w:numPr>
+          <w:ilvl w:val="0"/>
+          <w:numId w:val="2"/>
+        </w:numPr>
+        <w:spacing w:after="30"/>
+      </w:pPr>
+      <w:r>
+        <w:rPr>
+          <w:rFonts w:ascii="Calibri" w:cs="Calibri" w:eastAsia="Calibri" w:hAnsi="Calibri"/>
+          <w:sz w:val="19"/>
+          <w:szCs w:val="19"/>
+        </w:rPr>
+        <w:t>Ogni versione del prompt confrontata con scenari scritti a mano da me, con ripetizioni e punti instabili.</w:t>
+      </w:r>
+    </w:p>
+    <w:p>
+      <w:pPr>
+        <w:pStyle w:val="ListParagraph"/>
+        <w:numPr>
+          <w:ilvl w:val="0"/>
+          <w:numId w:val="2"/>
+        </w:numPr>
+        <w:spacing w:after="30"/>
+      </w:pPr>
+      <w:r>
+        <w:rPr>
+          <w:rFonts w:ascii="Calibri" w:cs="Calibri" w:eastAsia="Calibri" w:hAnsi="Calibri"/>
+          <w:sz w:val="19"/>
+          <w:szCs w:val="19"/>
+        </w:rPr>
+        <w:t>Passo A da 22 a 26 decisioni giuste su 32; una versione che sembrava migliore bocciata (10 su 32).</w:t>
+      </w:r>
+    </w:p>
+    <w:p>
+      <w:pPr>
+        <w:pStyle w:val="ListParagraph"/>
+        <w:numPr>
+          <w:ilvl w:val="0"/>
+          <w:numId w:val="2"/>
+        </w:numPr>
+        <w:spacing w:after="30"/>
+      </w:pPr>
+      <w:r>
+        <w:rPr>
+          <w:rFonts w:ascii="Calibri" w:cs="Calibri" w:eastAsia="Calibri" w:hAnsi="Calibri"/>
+          <w:sz w:val="19"/>
+          <w:szCs w:val="19"/>
+        </w:rPr>
+        <w:t>Stesse checklist, requisito vago 4 scenari, scritto bene 21: da qui il controllo del requisito, senza AI.</w:t>
+      </w:r>
+    </w:p>
+    <w:p>
+      <w:pPr>
+        <w:spacing w:after="60" w:before="60"/>
+      </w:pPr>
+      <w:hyperlink w:history="1" r:id="rId8">
+        <w:r>
+          <w:rPr>
+            <w:rFonts w:ascii="Calibri" w:cs="Calibri" w:eastAsia="Calibri" w:hAnsi="Calibri"/>
+            <w:color w:val="1D4ED8"/>
+            <w:sz w:val="19"/>
+            <w:szCs w:val="19"/>
+            <w:u w:val="single"/>
+          </w:rPr>
+          <w:t xml:space="preserve">github.com/11292-stella/qa-scenari-ai</w:t>
+        </w:r>
+      </w:hyperlink>
+    </w:p>
+    <w:p>
+      <w:pPr>
+        <w:keepNext/>
+        <w:tabs>
+          <w:tab w:val="right" w:pos="9638"/>
+        </w:tabs>
+        <w:spacing w:after="40" w:before="0"/>
+      </w:pPr>
+      <w:r>
+        <w:rPr>
+          <w:rFonts w:ascii="Calibri" w:cs="Calibri" w:eastAsia="Calibri" w:hAnsi="Calibri"/>
+          <w:b/>
+          <w:bCs/>
+          <w:sz w:val="22"/>
+          <w:szCs w:val="22"/>
+        </w:rPr>
         <w:t xml:space="preserve">Restaurant Management System — sviluppo e test automation full-stack</w:t>
       </w:r>
       <w:r>
@@ -726,7 +1015,7 @@
           <w:sz w:val="19"/>
           <w:szCs w:val="19"/>
         </w:rPr>
-        <w:t xml:space="preserve">Sistema completo per la gestione di un ristorante, progettato e sviluppato da zero per avere un'applicazione reale di cui conosco ogni parte, su cui fare test automation a tutti i livelli. Tre applicazioni sullo stesso backend (API REST, gestionale per lo staff, kiosk self-order per i clienti), testate a livello API, web e mobile.</w:t>
+        <w:t>Sistema per la gestione di un ristorante, sviluppato da zero per avere un'applicazione reale di cui conosco ogni parte: API REST in ASP.NET Core + PostgreSQL, gestionale Angular per lo staff e kiosk self-order Flutter, testati a livello API, web e mobile in GitLab CI con Docker.</w:t>
       </w:r>
     </w:p>
     <w:p>
@@ -747,603 +1036,60 @@
     </w:p>
     <w:p>
       <w:pPr>
-        <w:keepNext/>
-        <w:spacing w:after="30" w:before="40"/>
-      </w:pPr>
-      <w:r>
-        <w:rPr>
-          <w:rFonts w:ascii="Calibri" w:cs="Calibri" w:eastAsia="Calibri" w:hAnsi="Calibri"/>
-          <w:b/>
-          <w:bCs/>
-          <w:color w:val="6D28D9"/>
-          <w:sz w:val="19"/>
-          <w:szCs w:val="19"/>
-        </w:rPr>
-        <w:t xml:space="preserve">Backend — ASP.NET Core Web API (.NET 10)</w:t>
-      </w:r>
-    </w:p>
-    <w:p>
-      <w:pPr>
-        <w:pStyle w:val="ListParagraph"/>
-        <w:numPr>
-          <w:ilvl w:val="0"/>
-          <w:numId w:val="2"/>
-        </w:numPr>
-        <w:spacing w:after="30"/>
-      </w:pPr>
-      <w:r>
-        <w:rPr>
-          <w:rFonts w:ascii="Calibri" w:cs="Calibri" w:eastAsia="Calibri" w:hAnsi="Calibri"/>
-          <w:sz w:val="19"/>
-          <w:szCs w:val="19"/>
-        </w:rPr>
-        <w:t xml:space="preserve">EF Core + PostgreSQL con migration versionate; migration e seed del menu applicati all'avvio.</w:t>
-      </w:r>
-    </w:p>
-    <w:p>
-      <w:pPr>
-        <w:pStyle w:val="ListParagraph"/>
-        <w:numPr>
-          <w:ilvl w:val="0"/>
-          <w:numId w:val="2"/>
-        </w:numPr>
-        <w:spacing w:after="30"/>
-      </w:pPr>
-      <w:r>
-        <w:rPr>
-          <w:rFonts w:ascii="Calibri" w:cs="Calibri" w:eastAsia="Calibri" w:hAnsi="Calibri"/>
-          <w:sz w:val="19"/>
-          <w:szCs w:val="19"/>
-        </w:rPr>
-        <w:t xml:space="preserve">Autenticazione JWT con ruoli; middleware globale che mappa le eccezioni in 400/401/404/500.</w:t>
-      </w:r>
-    </w:p>
-    <w:p>
-      <w:pPr>
-        <w:pStyle w:val="ListParagraph"/>
-        <w:numPr>
-          <w:ilvl w:val="0"/>
-          <w:numId w:val="2"/>
-        </w:numPr>
-        <w:spacing w:after="30"/>
-      </w:pPr>
-      <w:r>
-        <w:rPr>
-          <w:rFonts w:ascii="Calibri" w:cs="Calibri" w:eastAsia="Calibri" w:hAnsi="Calibri"/>
-          <w:sz w:val="19"/>
-          <w:szCs w:val="19"/>
-        </w:rPr>
-        <w:t xml:space="preserve">Dominio: categorie, prodotti, ordini con righe e stati, scontrini contanti/carta, margini e food cost.</w:t>
-      </w:r>
-    </w:p>
-    <w:p>
-      <w:pPr>
-        <w:keepNext/>
-        <w:spacing w:after="30" w:before="40"/>
-      </w:pPr>
-      <w:r>
-        <w:rPr>
-          <w:rFonts w:ascii="Calibri" w:cs="Calibri" w:eastAsia="Calibri" w:hAnsi="Calibri"/>
-          <w:b/>
-          <w:bCs/>
-          <w:color w:val="6D28D9"/>
-          <w:sz w:val="19"/>
-          <w:szCs w:val="19"/>
-        </w:rPr>
-        <w:t xml:space="preserve">Frontend — Angular 20 · Flutter</w:t>
-      </w:r>
-    </w:p>
-    <w:p>
-      <w:pPr>
-        <w:pStyle w:val="ListParagraph"/>
-        <w:numPr>
-          <w:ilvl w:val="0"/>
-          <w:numId w:val="2"/>
-        </w:numPr>
-        <w:spacing w:after="30"/>
-      </w:pPr>
-      <w:r>
-        <w:rPr>
-          <w:rFonts w:ascii="Calibri" w:cs="Calibri" w:eastAsia="Calibri" w:hAnsi="Calibri"/>
-          <w:sz w:val="19"/>
-          <w:szCs w:val="19"/>
-        </w:rPr>
-        <w:t xml:space="preserve">Gestionale staff: standalone components, Reactive Forms, route guard, interceptor JWT (401 → login), Angular Material.</w:t>
-      </w:r>
-    </w:p>
-    <w:p>
-      <w:pPr>
-        <w:pStyle w:val="ListParagraph"/>
-        <w:numPr>
-          <w:ilvl w:val="0"/>
-          <w:numId w:val="2"/>
-        </w:numPr>
-        <w:spacing w:after="30"/>
-      </w:pPr>
-      <w:r>
-        <w:rPr>
-          <w:rFonts w:ascii="Calibri" w:cs="Calibri" w:eastAsia="Calibri" w:hAnsi="Calibri"/>
-          <w:sz w:val="19"/>
-          <w:szCs w:val="19"/>
-        </w:rPr>
-        <w:t xml:space="preserve">Ordini e scontrini con dialog di pagamento simulato (rifiuto, carta scaduta) e pagina statistiche.</w:t>
-      </w:r>
-    </w:p>
-    <w:p>
-      <w:pPr>
-        <w:pStyle w:val="ListParagraph"/>
-        <w:numPr>
-          <w:ilvl w:val="0"/>
-          <w:numId w:val="2"/>
-        </w:numPr>
-        <w:spacing w:after="30"/>
-      </w:pPr>
-      <w:r>
-        <w:rPr>
-          <w:rFonts w:ascii="Calibri" w:cs="Calibri" w:eastAsia="Calibri" w:hAnsi="Calibri"/>
-          <w:sz w:val="19"/>
-          <w:szCs w:val="19"/>
-        </w:rPr>
-        <w:t xml:space="preserve">Kiosk self-order Flutter + Riverpod (menu, carrello, conferma), build Windows standalone.</w:t>
-      </w:r>
-    </w:p>
-    <w:p>
-      <w:pPr>
-        <w:keepNext/>
-        <w:spacing w:after="30" w:before="40"/>
-      </w:pPr>
-      <w:r>
-        <w:rPr>
-          <w:rFonts w:ascii="Calibri" w:cs="Calibri" w:eastAsia="Calibri" w:hAnsi="Calibri"/>
-          <w:b/>
-          <w:bCs/>
-          <w:color w:val="6D28D9"/>
-          <w:sz w:val="19"/>
-          <w:szCs w:val="19"/>
-        </w:rPr>
-        <w:t xml:space="preserve">Test API — xUnit + Playwright .NET</w:t>
-      </w:r>
-    </w:p>
-    <w:p>
-      <w:pPr>
-        <w:pStyle w:val="ListParagraph"/>
-        <w:numPr>
-          <w:ilvl w:val="0"/>
-          <w:numId w:val="2"/>
-        </w:numPr>
-        <w:spacing w:after="30"/>
-      </w:pPr>
-      <w:r>
-        <w:rPr>
-          <w:rFonts w:ascii="Calibri" w:cs="Calibri" w:eastAsia="Calibri" w:hAnsi="Calibri"/>
-          <w:sz w:val="19"/>
-          <w:szCs w:val="19"/>
-        </w:rPr>
-        <w:t xml:space="preserve">49 test su Auth, Prodotti, Categorie, Ordini, Scontrini: casi validi, 401 senza token, 404, 400, 409.</w:t>
-      </w:r>
-    </w:p>
-    <w:p>
-      <w:pPr>
-        <w:pStyle w:val="ListParagraph"/>
-        <w:numPr>
-          <w:ilvl w:val="0"/>
-          <w:numId w:val="2"/>
-        </w:numPr>
-        <w:spacing w:after="30"/>
-      </w:pPr>
-      <w:r>
-        <w:rPr>
-          <w:rFonts w:ascii="Calibri" w:cs="Calibri" w:eastAsia="Calibri" w:hAnsi="Calibri"/>
-          <w:sz w:val="19"/>
-          <w:szCs w:val="19"/>
-        </w:rPr>
-        <w:t xml:space="preserve">Classe base condivisa, login "auto-riparante", test indipendenti: ognuno crea via API i propri dati.</w:t>
-      </w:r>
-    </w:p>
-    <w:p>
-      <w:pPr>
-        <w:pStyle w:val="ListParagraph"/>
-        <w:numPr>
-          <w:ilvl w:val="0"/>
-          <w:numId w:val="2"/>
-        </w:numPr>
-        <w:spacing w:after="30"/>
-      </w:pPr>
-      <w:r>
-        <w:rPr>
-          <w:rFonts w:ascii="Calibri" w:cs="Calibri" w:eastAsia="Calibri" w:hAnsi="Calibri"/>
-          <w:sz w:val="19"/>
-          <w:szCs w:val="19"/>
-        </w:rPr>
-        <w:t xml:space="preserve">URL del backend da variabile d'ambiente: stessi test in locale e in pipeline.</w:t>
-      </w:r>
-    </w:p>
-    <w:p>
-      <w:pPr>
-        <w:keepNext/>
-        <w:spacing w:after="30" w:before="40"/>
-      </w:pPr>
-      <w:r>
-        <w:rPr>
-          <w:rFonts w:ascii="Calibri" w:cs="Calibri" w:eastAsia="Calibri" w:hAnsi="Calibri"/>
-          <w:b/>
-          <w:bCs/>
-          <w:color w:val="6D28D9"/>
-          <w:sz w:val="19"/>
-          <w:szCs w:val="19"/>
-        </w:rPr>
-        <w:t xml:space="preserve">E2E — Robot Framework + Browser Library</w:t>
-      </w:r>
-    </w:p>
-    <w:p>
-      <w:pPr>
-        <w:pStyle w:val="ListParagraph"/>
-        <w:numPr>
-          <w:ilvl w:val="0"/>
-          <w:numId w:val="2"/>
-        </w:numPr>
-        <w:spacing w:after="30"/>
-      </w:pPr>
-      <w:r>
-        <w:rPr>
-          <w:rFonts w:ascii="Calibri" w:cs="Calibri" w:eastAsia="Calibri" w:hAnsi="Calibri"/>
-          <w:sz w:val="19"/>
-          <w:szCs w:val="19"/>
-        </w:rPr>
-        <w:t xml:space="preserve">94 test in 7 suite, approccio ibrido UI + API (RequestsLibrary): login via API, verifiche su UI e backend.</w:t>
-      </w:r>
-    </w:p>
-    <w:p>
-      <w:pPr>
-        <w:pStyle w:val="ListParagraph"/>
-        <w:numPr>
-          <w:ilvl w:val="0"/>
-          <w:numId w:val="2"/>
-        </w:numPr>
-        <w:spacing w:after="30"/>
-      </w:pPr>
-      <w:r>
-        <w:rPr>
-          <w:rFonts w:ascii="Calibri" w:cs="Calibri" w:eastAsia="Calibri" w:hAnsi="Calibri"/>
-          <w:sz w:val="19"/>
-          <w:szCs w:val="19"/>
-        </w:rPr>
-        <w:t xml:space="preserve">Page object in .resource, dati con FakerLibrary, teardown nell'ordine delle dipendenze, tag per sottoinsiemi.</w:t>
-      </w:r>
-    </w:p>
-    <w:p>
-      <w:pPr>
-        <w:pStyle w:val="ListParagraph"/>
-        <w:numPr>
-          <w:ilvl w:val="0"/>
-          <w:numId w:val="2"/>
-        </w:numPr>
-        <w:spacing w:after="30"/>
-      </w:pPr>
-      <w:r>
-        <w:rPr>
-          <w:rFonts w:ascii="Calibri" w:cs="Calibri" w:eastAsia="Calibri" w:hAnsi="Calibri"/>
-          <w:sz w:val="19"/>
-          <w:szCs w:val="19"/>
-        </w:rPr>
-        <w:t xml:space="preserve">Suite stabilizzata e resa ~3× più veloce (50s → 16s) analizzando i tempi nel log.html.</w:t>
-      </w:r>
-    </w:p>
-    <w:p>
-      <w:pPr>
-        <w:pStyle w:val="ListParagraph"/>
-        <w:numPr>
-          <w:ilvl w:val="0"/>
-          <w:numId w:val="2"/>
-        </w:numPr>
-        <w:spacing w:after="30"/>
-      </w:pPr>
-      <w:r>
-        <w:rPr>
-          <w:rFonts w:ascii="Calibri" w:cs="Calibri" w:eastAsia="Calibri" w:hAnsi="Calibri"/>
-          <w:sz w:val="19"/>
-          <w:szCs w:val="19"/>
-        </w:rPr>
-        <w:t xml:space="preserve">HTML + screenshot automatici sui fallimenti; recorder che ricava la mappa degli endpoint dai test E2E; checklist black box.</w:t>
-      </w:r>
-    </w:p>
-    <w:p>
-      <w:pPr>
-        <w:keepNext/>
-        <w:spacing w:after="30" w:before="40"/>
-      </w:pPr>
-      <w:r>
-        <w:rPr>
-          <w:rFonts w:ascii="Calibri" w:cs="Calibri" w:eastAsia="Calibri" w:hAnsi="Calibri"/>
-          <w:b/>
-          <w:bCs/>
-          <w:color w:val="6D28D9"/>
-          <w:sz w:val="19"/>
-          <w:szCs w:val="19"/>
-        </w:rPr>
-        <w:t xml:space="preserve">Mobile E2E — Appium + Cucumber (Java)</w:t>
-      </w:r>
-    </w:p>
-    <w:p>
-      <w:pPr>
-        <w:pStyle w:val="ListParagraph"/>
-        <w:numPr>
-          <w:ilvl w:val="0"/>
-          <w:numId w:val="2"/>
-        </w:numPr>
-        <w:spacing w:after="30"/>
-      </w:pPr>
-      <w:r>
-        <w:rPr>
-          <w:rFonts w:ascii="Calibri" w:cs="Calibri" w:eastAsia="Calibri" w:hAnsi="Calibri"/>
-          <w:sz w:val="19"/>
-          <w:szCs w:val="19"/>
-        </w:rPr>
-        <w:t xml:space="preserve">26 scenari BDD in Gherkin italiano sul kiosk Flutter: driver Flutter Integration, locator sulle Key, Page Object.</w:t>
-      </w:r>
-    </w:p>
-    <w:p>
-      <w:pPr>
-        <w:pStyle w:val="ListParagraph"/>
-        <w:numPr>
-          <w:ilvl w:val="0"/>
-          <w:numId w:val="2"/>
-        </w:numPr>
-        <w:spacing w:after="30"/>
-      </w:pPr>
-      <w:r>
-        <w:rPr>
-          <w:rFonts w:ascii="Calibri" w:cs="Calibri" w:eastAsia="Calibri" w:hAnsi="Calibri"/>
-          <w:sz w:val="19"/>
-          <w:szCs w:val="19"/>
-        </w:rPr>
-        <w:t xml:space="preserve">Verifica ibrida UI + API con REST Assured: l'ordine fatto dall'app è controllato nel backend (cliente, righe, totale).</w:t>
-      </w:r>
-    </w:p>
-    <w:p>
-      <w:pPr>
-        <w:pStyle w:val="ListParagraph"/>
-        <w:numPr>
-          <w:ilvl w:val="0"/>
-          <w:numId w:val="2"/>
-        </w:numPr>
-        <w:spacing w:after="30"/>
-      </w:pPr>
-      <w:r>
-        <w:rPr>
-          <w:rFonts w:ascii="Calibri" w:cs="Calibri" w:eastAsia="Calibri" w:hAnsi="Calibri"/>
-          <w:sz w:val="19"/>
-          <w:szCs w:val="19"/>
-        </w:rPr>
-        <w:t xml:space="preserve">Scenario Outline, Datafaker, tag smoke/regressione/bug, attese su condizione, report Allure.</w:t>
-      </w:r>
-    </w:p>
-    <w:p>
-      <w:pPr>
-        <w:keepNext/>
-        <w:spacing w:after="30" w:before="40"/>
-      </w:pPr>
-      <w:r>
-        <w:rPr>
-          <w:rFonts w:ascii="Calibri" w:cs="Calibri" w:eastAsia="Calibri" w:hAnsi="Calibri"/>
-          <w:b/>
-          <w:bCs/>
-          <w:color w:val="6D28D9"/>
-          <w:sz w:val="19"/>
-          <w:szCs w:val="19"/>
-        </w:rPr>
-        <w:t xml:space="preserve">CI/CD — GitLab CI + Docker</w:t>
-      </w:r>
-    </w:p>
-    <w:p>
-      <w:pPr>
-        <w:pStyle w:val="ListParagraph"/>
-        <w:numPr>
-          <w:ilvl w:val="0"/>
-          <w:numId w:val="2"/>
-        </w:numPr>
-        <w:spacing w:after="30"/>
-      </w:pPr>
-      <w:r>
-        <w:rPr>
-          <w:rFonts w:ascii="Calibri" w:cs="Calibri" w:eastAsia="Calibri" w:hAnsi="Calibri"/>
-          <w:sz w:val="19"/>
-          <w:szCs w:val="19"/>
-        </w:rPr>
-        <w:t xml:space="preserve">Dockerfile multi-stage e Docker Compose con Postgres usa e getta: a ogni push build, migration, seed, test e report JUnit.</w:t>
-      </w:r>
-    </w:p>
-    <w:p>
-      <w:pPr>
-        <w:pStyle w:val="ListParagraph"/>
-        <w:numPr>
-          <w:ilvl w:val="0"/>
-          <w:numId w:val="2"/>
-        </w:numPr>
-        <w:spacing w:after="30"/>
-      </w:pPr>
-      <w:r>
-        <w:rPr>
-          <w:rFonts w:ascii="Calibri" w:cs="Calibri" w:eastAsia="Calibri" w:hAnsi="Calibri"/>
-          <w:sz w:val="19"/>
-          <w:szCs w:val="19"/>
-        </w:rPr>
-        <w:t xml:space="preserve">Risolti problemi reali: race condition tra test, dipendenza dai dati, conflitti di porte (override Compose), volumi vuoti con il socket Docker dell'host.</w:t>
-      </w:r>
-    </w:p>
-    <w:p>
-      <w:pPr>
-        <w:keepNext/>
-        <w:spacing w:after="30" w:before="40"/>
-      </w:pPr>
-      <w:r>
-        <w:rPr>
-          <w:rFonts w:ascii="Calibri" w:cs="Calibri" w:eastAsia="Calibri" w:hAnsi="Calibri"/>
-          <w:b/>
-          <w:bCs/>
-          <w:color w:val="6D28D9"/>
-          <w:sz w:val="19"/>
-          <w:szCs w:val="19"/>
-        </w:rPr>
-        <w:t xml:space="preserve">Bug reali trovati dai test</w:t>
-      </w:r>
-    </w:p>
-    <w:p>
-      <w:pPr>
-        <w:pStyle w:val="ListParagraph"/>
-        <w:numPr>
-          <w:ilvl w:val="0"/>
-          <w:numId w:val="2"/>
-        </w:numPr>
-        <w:spacing w:after="30"/>
-      </w:pPr>
-      <w:r>
-        <w:rPr>
-          <w:rFonts w:ascii="Calibri" w:cs="Calibri" w:eastAsia="Calibri" w:hAnsi="Calibri"/>
-          <w:b/>
-          <w:bCs/>
-          <w:sz w:val="19"/>
-          <w:szCs w:val="19"/>
-        </w:rPr>
-        <w:t xml:space="preserve">Cascade delete:</w:t>
-      </w:r>
-      <w:r>
-        <w:rPr>
-          <w:rFonts w:ascii="Calibri" w:cs="Calibri" w:eastAsia="Calibri" w:hAnsi="Calibri"/>
-          <w:sz w:val="19"/>
-          <w:szCs w:val="19"/>
-        </w:rPr>
-        <w:t xml:space="preserve"> eliminare una categoria cancellava prodotti e ordini storici → 409 + vincolo Restrict.</w:t>
-      </w:r>
-    </w:p>
-    <w:p>
-      <w:pPr>
-        <w:pStyle w:val="ListParagraph"/>
-        <w:numPr>
-          <w:ilvl w:val="0"/>
-          <w:numId w:val="2"/>
-        </w:numPr>
-        <w:spacing w:after="30"/>
-      </w:pPr>
-      <w:r>
-        <w:rPr>
-          <w:rFonts w:ascii="Calibri" w:cs="Calibri" w:eastAsia="Calibri" w:hAnsi="Calibri"/>
-          <w:b/>
-          <w:bCs/>
-          <w:sz w:val="19"/>
-          <w:szCs w:val="19"/>
-        </w:rPr>
-        <w:t xml:space="preserve">Pagamenti e scontrini:</w:t>
-      </w:r>
-      <w:r>
-        <w:rPr>
-          <w:rFonts w:ascii="Calibri" w:cs="Calibri" w:eastAsia="Calibri" w:hAnsi="Calibri"/>
-          <w:sz w:val="19"/>
-          <w:szCs w:val="19"/>
-        </w:rPr>
-        <w:t xml:space="preserve"> carta scaduta accettata, scontrino su ordine annullato, doppio click con doppia emissione.</w:t>
-      </w:r>
-    </w:p>
-    <w:p>
-      <w:pPr>
-        <w:pStyle w:val="ListParagraph"/>
-        <w:numPr>
-          <w:ilvl w:val="0"/>
-          <w:numId w:val="2"/>
-        </w:numPr>
-        <w:spacing w:after="30"/>
-      </w:pPr>
-      <w:r>
-        <w:rPr>
-          <w:rFonts w:ascii="Calibri" w:cs="Calibri" w:eastAsia="Calibri" w:hAnsi="Calibri"/>
-          <w:b/>
-          <w:bCs/>
-          <w:sz w:val="19"/>
-          <w:szCs w:val="19"/>
-        </w:rPr>
-        <w:t xml:space="preserve">Validazione:</w:t>
-      </w:r>
-      <w:r>
-        <w:rPr>
-          <w:rFonts w:ascii="Calibri" w:cs="Calibri" w:eastAsia="Calibri" w:hAnsi="Calibri"/>
-          <w:sz w:val="19"/>
-          <w:szCs w:val="19"/>
-        </w:rPr>
-        <w:t xml:space="preserve"> stato ordine fuori enum salvato, nome di soli spazi, disallineamento form/DTO.</w:t>
-      </w:r>
-    </w:p>
-    <w:p>
-      <w:pPr>
-        <w:pStyle w:val="ListParagraph"/>
-        <w:numPr>
-          <w:ilvl w:val="0"/>
-          <w:numId w:val="2"/>
-        </w:numPr>
-        <w:spacing w:after="30"/>
-      </w:pPr>
-      <w:r>
-        <w:rPr>
-          <w:rFonts w:ascii="Calibri" w:cs="Calibri" w:eastAsia="Calibri" w:hAnsi="Calibri"/>
-          <w:b/>
-          <w:bCs/>
-          <w:sz w:val="19"/>
-          <w:szCs w:val="19"/>
-        </w:rPr>
-        <w:t xml:space="preserve">Privilege escalation:</w:t>
-      </w:r>
-      <w:r>
-        <w:rPr>
-          <w:rFonts w:ascii="Calibri" w:cs="Calibri" w:eastAsia="Calibri" w:hAnsi="Calibri"/>
-          <w:sz w:val="19"/>
-          <w:szCs w:val="19"/>
-        </w:rPr>
-        <w:t xml:space="preserve"> ruolo accettato dal client in registrazione, documentato con un test API.</w:t>
-      </w:r>
-    </w:p>
-    <w:p>
-      <w:pPr>
-        <w:pStyle w:val="ListParagraph"/>
-        <w:numPr>
-          <w:ilvl w:val="0"/>
-          <w:numId w:val="2"/>
-        </w:numPr>
-        <w:spacing w:after="30"/>
-      </w:pPr>
-      <w:r>
-        <w:rPr>
-          <w:rFonts w:ascii="Calibri" w:cs="Calibri" w:eastAsia="Calibri" w:hAnsi="Calibri"/>
-          <w:b/>
-          <w:bCs/>
-          <w:sz w:val="19"/>
-          <w:szCs w:val="19"/>
-        </w:rPr>
-        <w:t xml:space="preserve">Kiosk mobile:</w:t>
-      </w:r>
-      <w:r>
-        <w:rPr>
-          <w:rFonts w:ascii="Calibri" w:cs="Calibri" w:eastAsia="Calibri" w:hAnsi="Calibri"/>
-          <w:sz w:val="19"/>
-          <w:szCs w:val="19"/>
-        </w:rPr>
-        <w:t xml:space="preserve"> note del cliente perse prima del backend, costo di produzione esposto all'app pubblica (OWASP API), menu mai ricaricato, filtro che resta al cliente successivo.</w:t>
-      </w:r>
-    </w:p>
-    <w:p>
-      <w:pPr>
-        <w:pStyle w:val="ListParagraph"/>
-        <w:numPr>
-          <w:ilvl w:val="0"/>
-          <w:numId w:val="2"/>
-        </w:numPr>
-        <w:spacing w:after="30"/>
-      </w:pPr>
-      <w:r>
-        <w:rPr>
-          <w:rFonts w:ascii="Calibri" w:cs="Calibri" w:eastAsia="Calibri" w:hAnsi="Calibri"/>
-          <w:sz w:val="19"/>
-          <w:szCs w:val="19"/>
-        </w:rPr>
-        <w:t xml:space="preserve">Per ogni fix: test rosso prima, verde dopo, test di regressione in suite.</w:t>
+        <w:pStyle w:val="ListParagraph"/>
+        <w:numPr>
+          <w:ilvl w:val="0"/>
+          <w:numId w:val="2"/>
+        </w:numPr>
+        <w:spacing w:after="30"/>
+      </w:pPr>
+      <w:r>
+        <w:rPr>
+          <w:rFonts w:ascii="Calibri" w:cs="Calibri" w:eastAsia="Calibri" w:hAnsi="Calibri"/>
+          <w:b/>
+          <w:bCs/>
+          <w:sz w:val="19"/>
+          <w:szCs w:val="19"/>
+        </w:rPr>
+        <w:t>Test:</w:t>
+      </w:r>
+      <w:r>
+        <w:rPr>
+          <w:rFonts w:ascii="Calibri" w:cs="Calibri" w:eastAsia="Calibri" w:hAnsi="Calibri"/>
+          <w:bCs/>
+          <w:sz w:val="19"/>
+          <w:szCs w:val="19"/>
+        </w:rPr>
+        <w:t xml:space="preserve"> xUnit + Playwright .NET sulle API; Robot Framework + Browser Library con approccio ibrido UI + API (suite resa ~3× più veloce); Appium + Cucumber in Gherkin italiano sul kiosk, con verifica dell'ordine nel backend via REST Assured.</w:t>
+      </w:r>
+    </w:p>
+    <w:p>
+      <w:pPr>
+        <w:pStyle w:val="ListParagraph"/>
+        <w:numPr>
+          <w:ilvl w:val="0"/>
+          <w:numId w:val="2"/>
+        </w:numPr>
+        <w:spacing w:after="30"/>
+      </w:pPr>
+      <w:r>
+        <w:rPr>
+          <w:rFonts w:ascii="Calibri" w:cs="Calibri" w:eastAsia="Calibri" w:hAnsi="Calibri"/>
+          <w:b/>
+          <w:bCs/>
+          <w:sz w:val="19"/>
+          <w:szCs w:val="19"/>
+        </w:rPr>
+        <w:t>Bug trovati:</w:t>
+      </w:r>
+      <w:r>
+        <w:rPr>
+          <w:rFonts w:ascii="Calibri" w:cs="Calibri" w:eastAsia="Calibri" w:hAnsi="Calibri"/>
+          <w:bCs/>
+          <w:sz w:val="19"/>
+          <w:szCs w:val="19"/>
+        </w:rPr>
+        <w:t xml:space="preserve"> cascade delete su categorie e ordini storici, carta scaduta accettata, privilege escalation in registrazione, costo di produzione esposto all'app pubblica (OWASP API). Per ogni fix: test rosso prima, verde dopo.</w:t>
       </w:r>
     </w:p>
     <w:p>
@@ -1897,7 +1643,36 @@
           <w:sz w:val="19"/>
           <w:szCs w:val="19"/>
         </w:rPr>
-        <w:t xml:space="preserve">Applicazioni complete su repository GitHub pubblici, con codice, test automatici e pipeline CI (dettagli in "Progetto principale" e "Altri progetti").</w:t>
+        <w:t>Applicazioni complete su repository GitHub pubblici, con codice, test automatici e pipeline CI (dettagli in "Progetti principali" e "Altri progetti").</w:t>
+      </w:r>
+    </w:p>
+    <w:p>
+      <w:pPr>
+        <w:pStyle w:val="ListParagraph"/>
+        <w:numPr>
+          <w:ilvl w:val="0"/>
+          <w:numId w:val="2"/>
+        </w:numPr>
+        <w:spacing w:after="30"/>
+      </w:pPr>
+      <w:r>
+        <w:rPr>
+          <w:rFonts w:ascii="Calibri" w:cs="Calibri" w:eastAsia="Calibri" w:hAnsi="Calibri"/>
+          <w:b/>
+          <w:bCs/>
+          <w:sz w:val="19"/>
+          <w:szCs w:val="19"/>
+        </w:rPr>
+        <w:t>QA Scenari AI</w:t>
+      </w:r>
+      <w:r>
+        <w:rPr>
+          <w:rFonts w:ascii="Calibri" w:cs="Calibri" w:eastAsia="Calibri" w:hAnsi="Calibri"/>
+          <w:bCs/>
+          <w:sz w:val="19"/>
+          <w:szCs w:val="19"/>
+        </w:rPr>
+        <w:t xml:space="preserve"> — strumento in Python/Django con un modello AI locale (Ollama): dal requisito scenari Gherkin, domande aperte e scheletri Playwright / Robot / Appium; 24 checklist, 13 controlli automatici, prompt misurati con ripetizioni.</w:t>
       </w:r>
     </w:p>
     <w:p>

</xml_diff>